<commit_message>
Add project members, repository link, and data sample
Co-Authored-By: Claude Code <noreply@anthropic.com>
</commit_message>
<xml_diff>
--- a/report/REPORT.docx
+++ b/report/REPORT.docx
@@ -29,7 +29,7 @@
         </w:rPr>
         <w:t>机器学习课程大作业 · B 类（工程实践型）</w:t>
         <w:br/>
-        <w:t>姓名/学号：待填写  |  组员：待填写  |  2026-10-19</w:t>
+        <w:t>姓名/学号：胥昊天（学号待填写）  |  组员：曹奕伦、徐厚泽、彭泽宇、刘翔  |  2026-10-19</w:t>
       </w:r>
     </w:p>
     <w:p>
@@ -3068,7 +3068,7 @@
                 <w:rFonts w:ascii="Noto Serif CJK SC" w:hAnsi="Noto Serif CJK SC" w:eastAsia="Noto Serif CJK SC"/>
                 <w:sz w:val="17"/>
               </w:rPr>
-              <w:t>待填写（提交前上传并回填链接）</w:t>
+              <w:t>https://github.com/xht03/2026ML</w:t>
             </w:r>
           </w:p>
         </w:tc>
@@ -3437,7 +3437,7 @@
                 <w:rFonts w:ascii="Noto Serif CJK SC" w:hAnsi="Noto Serif CJK SC" w:eastAsia="Noto Serif CJK SC"/>
                 <w:sz w:val="17"/>
               </w:rPr>
-              <w:t>待填写：数据/环境、训练、评测、报告</w:t>
+              <w:t>胥昊天：环境/数据/训练/评测/报告整合；曹奕伦、徐厚泽、彭泽宇、刘翔：数据分析、视频审查、报告校对（具体分工可按组内实际情况调整）</w:t>
             </w:r>
           </w:p>
         </w:tc>

</xml_diff>

<commit_message>
Reorganize results and add team information
- results/: final / train / analysis / archive
- remove duplicate per-model CSVs
- add student IDs and balanced team division
- regenerate 6-page report

Co-Authored-By: Claude Code <noreply@anthropic.com>
</commit_message>
<xml_diff>
--- a/report/REPORT.docx
+++ b/report/REPORT.docx
@@ -29,7 +29,9 @@
         </w:rPr>
         <w:t>机器学习课程大作业 · B 类（工程实践型）</w:t>
         <w:br/>
-        <w:t>姓名/学号：胥昊天（学号待填写）  |  组员：曹奕伦、徐厚泽、彭泽宇、刘翔  |  2026-10-19</w:t>
+        <w:t>姓名/学号：胥昊天（26213050409）  |  2026-10-19</w:t>
+        <w:br/>
+        <w:t>组员：曹奕伦（26113050003）、徐厚泽（26113050327）、彭泽宇（26213050317）、刘翔（26113050287）</w:t>
       </w:r>
     </w:p>
     <w:p>
@@ -1121,7 +1123,7 @@
                 <w:rFonts w:ascii="Noto Serif CJK SC" w:hAnsi="Noto Serif CJK SC" w:eastAsia="Noto Serif CJK SC"/>
                 <w:sz w:val="17"/>
               </w:rPr>
-              <w:t>results/train_log.txt</w:t>
+              <w:t>results/train/train_log.txt</w:t>
             </w:r>
           </w:p>
         </w:tc>
@@ -1662,7 +1664,7 @@
           <w:color w:val="555555"/>
           <w:sz w:val="18"/>
         </w:rPr>
-        <w:t>重要修正：社区适配器最初直接把原始指令传给 processor，漏掉了 OpenVLA 训练时的 prompt 模板（In: What action should the robot take to {instruction}?\nOut:）。修正后我们重跑了 Base/Final 的 40 个正式 episode；本报告结果均为修正 prompt 后的结果。修正前的裸 prompt 结果归档在 results/archive_bareprompt/，不用于最终结论。</w:t>
+        <w:t>重要修正：社区适配器最初直接把原始指令传给 processor，漏掉了 OpenVLA 训练时的 prompt 模板（In: What action should the robot take to {instruction}?\nOut:）。修正后我们重跑了 Base/Final 的 40 个正式 episode；本报告结果均为修正 prompt 后的结果。修正前的裸 prompt 结果归档在 results/archive/bare_prompt/，不用于最终结论。</w:t>
       </w:r>
     </w:p>
     <w:p>
@@ -2012,7 +2014,7 @@
           <w:b w:val="0"/>
           <w:sz w:val="21"/>
         </w:rPr>
-        <w:t>Final − Base = +10.0 个百分点（T1 −10.0，T2 +30.0）。40 个 episode 全部按预注册清单完成，逐 episode 记录在 results/episodes.csv，汇总在 results/results.csv，视频在 results/videos_openvla/。</w:t>
+        <w:t>Final − Base = +10.0 个百分点（T1 −10.0，T2 +30.0）。40 个 episode 全部按预注册清单完成，逐 episode 记录在 results/episodes.csv，汇总在 results/results.csv，视频在 results/videos/。</w:t>
       </w:r>
     </w:p>
     <w:p>
@@ -2025,7 +2027,7 @@
           <w:b w:val="0"/>
           <w:sz w:val="21"/>
         </w:rPr>
-        <w:t>作为消融：同样修正 prompt、但不加模糊时，Base/Final 在正式 40 个 episode 上均为 0/10（归档在 results/archive_sharp/）。因此本次提升主要来自图像域适应；Final 相对 Base 的 +10.0 pp 则来自 LoRA 微调（主要集中在 T2）。10 个 episode 的方差较大，+10.0 pp 和 T2 +30.0 pp 不能视为稳定优势。</w:t>
+        <w:t>作为消融：同样修正 prompt、但不加模糊时，Base/Final 在正式 40 个 episode 上均为 0/10（归档在 results/archive/sharp_baseline/）。因此本次提升主要来自图像域适应；Final 相对 Base 的 +10.0 pp 则来自 LoRA 微调（主要集中在 T2）。10 个 episode 的方差较大，+10.0 pp 和 T2 +30.0 pp 不能视为稳定优势。</w:t>
       </w:r>
     </w:p>
     <w:p>
@@ -2322,7 +2324,7 @@
           <w:b w:val="0"/>
           <w:sz w:val="19"/>
         </w:rPr>
-        <w:t>在真实 BridgeData 帧上，OpenVLA 的预测与数据集真实动作非常接近，夹爪开/闭也一致。这说明 prompt 模板、动作 token 解码、反归一化和图像预处理都是正确的；SimplerEnv 中的 0 成功不能解释为动作接口接错，主因是真实 Bridge 图像与仿真渲染图像之间的域差异，以及当前 LoRA 微调规模有限。脚本与输出：scripts/check_openvla_real.py、results/diagnostics_real_bridge.txt。进一步定位到：仿真渲染图像比真实相机图像更锐利；sharp 模式下 debug 夹爪长期为 0.9961（张开），加入 sigma=1.5 模糊后夹爪开始闭合。sharp 正式评测 Base/Final 均为 0/10；blur 正式评测 Base 20.0、Final 30.0。</w:t>
+        <w:t>在真实 BridgeData 帧上，OpenVLA 的预测与数据集真实动作非常接近，夹爪开/闭也一致。这说明 prompt 模板、动作 token 解码、反归一化和图像预处理都是正确的；SimplerEnv 中的 0 成功不能解释为动作接口接错，主因是真实 Bridge 图像与仿真渲染图像之间的域差异，以及当前 LoRA 微调规模有限。脚本与输出：scripts/check_openvla_real.py、results/analysis/diagnostics_real_bridge.txt。进一步定位到：仿真渲染图像比真实相机图像更锐利；sharp 模式下 debug 夹爪长期为 0.9961（张开），加入 sigma=1.5 模糊后夹爪开始闭合。sharp 正式评测 Base/Final 均为 0/10；blur 正式评测 Base 20.0、Final 30.0。</w:t>
       </w:r>
     </w:p>
     <w:p>
@@ -3396,7 +3398,7 @@
                 <w:rFonts w:ascii="Noto Serif CJK SC" w:hAnsi="Noto Serif CJK SC" w:eastAsia="Noto Serif CJK SC"/>
                 <w:sz w:val="17"/>
               </w:rPr>
-              <w:t>results/videos_openvla/；代表视频清单 video_links.md</w:t>
+              <w:t>results/videos/；代表视频清单 video_links.md</w:t>
             </w:r>
           </w:p>
         </w:tc>
@@ -3437,7 +3439,7 @@
                 <w:rFonts w:ascii="Noto Serif CJK SC" w:hAnsi="Noto Serif CJK SC" w:eastAsia="Noto Serif CJK SC"/>
                 <w:sz w:val="17"/>
               </w:rPr>
-              <w:t>胥昊天：环境/数据/训练/评测/报告整合；曹奕伦、徐厚泽、彭泽宇、刘翔：数据分析、视频审查、报告校对（具体分工可按组内实际情况调整）</w:t>
+              <w:t>胥昊天：项目统筹、环境/数据管线、LoRA 训练与最终评测、报告整合；曹奕伦：BridgeData 筛选与 RLDS 构建、训练日志与验证 loss 分析；徐厚泽：SimplerEnv 评测脚本、初始状态清单与逐 episode 结果汇总；彭泽宇：视频采集与代表性 episode 分析、失败原因整理；刘翔：模型/文献调研、复现文档与报告校对</w:t>
             </w:r>
           </w:p>
         </w:tc>

</xml_diff>